<commit_message>
fix(batch): guarantee SSE sentinel and FAILED state on batch job crash (v2.4.9, GAP #8)
_run_with_semaphore in routes.py now wraps the pipeline loop in
try/except/finally. If run_pipeline() raises unexpectedly: the exception
is logged, the job is written FAILED in the DB, a synthetic FAILED SSE
event is pushed, and the None sentinel is placed in the finally block —
preventing the SSE stream from hanging indefinitely.

Also includes:
- Wire manifest overrides into resume_after_security_fix_request path
  (orchestrator.py) so re-run after remediation respects reviewer overrides
- Reformat security_rules.yaml (whitespace/quoting only, no logic change)
- Docs: Changelog and BPG updated through v2.4.9

Co-Authored-By: Claude Sonnet 4.6 <noreply@anthropic.com>
</commit_message>
<xml_diff>
--- a/docs/Informatica Conversion Tool - Best Practices Guide.docx
+++ b/docs/Informatica Conversion Tool - Best Practices Guide.docx
@@ -76,7 +76,7 @@
                 <w:sz w:val="18"/>
                 <w:szCs w:val="18"/>
               </w:rPr>
-              <w:t xml:space="preserve">Version 2.3.5  •  For Data Migration Engineers and Reviewers</w:t>
+              <w:t xml:space="preserve">Version 2.4.9  •  For Data Migration Engineers and Reviewers</w:t>
             </w:r>
           </w:p>
         </w:tc>
@@ -3129,6 +3129,144 @@
           </w:p>
         </w:tc>
       </w:tr>
+      <w:tr>
+        <w:tc>
+          <w:tcPr>
+            <w:tcW w:type="dxa" w:w="1200"/>
+            <w:tcBorders>
+              <w:top w:val="single" w:color="CCCCCC" w:sz="4"/>
+              <w:left w:val="single" w:color="CCCCCC" w:sz="4"/>
+              <w:bottom w:val="single" w:color="CCCCCC" w:sz="4"/>
+              <w:right w:val="single" w:color="CCCCCC" w:sz="4"/>
+            </w:tcBorders>
+            <w:shd w:fill="E2EFDA" w:val="clear"/>
+            <w:tcMar>
+              <w:top w:type="dxa" w:w="80"/>
+              <w:left w:type="dxa" w:w="120"/>
+              <w:bottom w:type="dxa" w:w="80"/>
+              <w:right w:type="dxa" w:w="120"/>
+            </w:tcMar>
+            <w:vAlign w:val="center"/>
+          </w:tcPr>
+          <w:p>
+            <w:pPr>
+              <w:jc w:val="center"/>
+            </w:pPr>
+            <w:r>
+              <w:rPr>
+                <w:rFonts w:ascii="Arial" w:cs="Arial" w:eastAsia="Arial" w:hAnsi="Arial"/>
+                <w:b/>
+                <w:bCs/>
+                <w:sz w:val="22"/>
+                <w:szCs w:val="22"/>
+              </w:rPr>
+              <w:t xml:space="preserve">✅</w:t>
+            </w:r>
+          </w:p>
+        </w:tc>
+        <w:tc>
+          <w:tcPr>
+            <w:tcW w:type="dxa" w:w="8160"/>
+            <w:tcBorders>
+              <w:top w:val="single" w:color="CCCCCC" w:sz="4"/>
+              <w:left w:val="single" w:color="CCCCCC" w:sz="4"/>
+              <w:bottom w:val="single" w:color="CCCCCC" w:sz="4"/>
+              <w:right w:val="single" w:color="CCCCCC" w:sz="4"/>
+            </w:tcBorders>
+            <w:shd w:fill="E2EFDA" w:val="clear"/>
+            <w:tcMar>
+              <w:top w:type="dxa" w:w="80"/>
+              <w:left w:type="dxa" w:w="120"/>
+              <w:bottom w:type="dxa" w:w="80"/>
+              <w:right w:type="dxa" w:w="120"/>
+            </w:tcMar>
+            <w:vAlign w:val="center"/>
+          </w:tcPr>
+          <w:p>
+            <w:pPr>
+              <w:spacing w:after="0" w:before="0"/>
+            </w:pPr>
+            <w:r>
+              <w:rPr>
+                <w:rFonts w:ascii="Arial" w:cs="Arial" w:eastAsia="Arial" w:hAnsi="Arial"/>
+                <w:color w:val="1A1A1A"/>
+                <w:sz w:val="22"/>
+                <w:szCs w:val="22"/>
+              </w:rPr>
+              <w:t xml:space="preserve">Output validation — after conversion, generated files are checked for empty content, &gt;60% TODO stubs, Python syntax errors, missing SparkSession (PySpark jobs), and missing SELECT (dbt models). Validation failures are surfaced as warnings in the job panel before Gate 3.</w:t>
+            </w:r>
+          </w:p>
+        </w:tc>
+      </w:tr>
+      <w:tr>
+        <w:tc>
+          <w:tcPr>
+            <w:tcW w:type="dxa" w:w="1200"/>
+            <w:tcBorders>
+              <w:top w:val="single" w:color="CCCCCC" w:sz="4"/>
+              <w:left w:val="single" w:color="CCCCCC" w:sz="4"/>
+              <w:bottom w:val="single" w:color="CCCCCC" w:sz="4"/>
+              <w:right w:val="single" w:color="CCCCCC" w:sz="4"/>
+            </w:tcBorders>
+            <w:shd w:fill="E2EFDA" w:val="clear"/>
+            <w:tcMar>
+              <w:top w:type="dxa" w:w="80"/>
+              <w:left w:type="dxa" w:w="120"/>
+              <w:bottom w:type="dxa" w:w="80"/>
+              <w:right w:type="dxa" w:w="120"/>
+            </w:tcMar>
+            <w:vAlign w:val="center"/>
+          </w:tcPr>
+          <w:p>
+            <w:pPr>
+              <w:jc w:val="center"/>
+            </w:pPr>
+            <w:r>
+              <w:rPr>
+                <w:rFonts w:ascii="Arial" w:cs="Arial" w:eastAsia="Arial" w:hAnsi="Arial"/>
+                <w:b/>
+                <w:bCs/>
+                <w:sz w:val="22"/>
+                <w:szCs w:val="22"/>
+              </w:rPr>
+              <w:t xml:space="preserve">✅</w:t>
+            </w:r>
+          </w:p>
+        </w:tc>
+        <w:tc>
+          <w:tcPr>
+            <w:tcW w:type="dxa" w:w="8160"/>
+            <w:tcBorders>
+              <w:top w:val="single" w:color="CCCCCC" w:sz="4"/>
+              <w:left w:val="single" w:color="CCCCCC" w:sz="4"/>
+              <w:bottom w:val="single" w:color="CCCCCC" w:sz="4"/>
+              <w:right w:val="single" w:color="CCCCCC" w:sz="4"/>
+            </w:tcBorders>
+            <w:shd w:fill="E2EFDA" w:val="clear"/>
+            <w:tcMar>
+              <w:top w:type="dxa" w:w="80"/>
+              <w:left w:type="dxa" w:w="120"/>
+              <w:bottom w:type="dxa" w:w="80"/>
+              <w:right w:type="dxa" w:w="120"/>
+            </w:tcMar>
+            <w:vAlign w:val="center"/>
+          </w:tcPr>
+          <w:p>
+            <w:pPr>
+              <w:spacing w:after="0" w:before="0"/>
+            </w:pPr>
+            <w:r>
+              <w:rPr>
+                <w:rFonts w:ascii="Arial" w:cs="Arial" w:eastAsia="Arial" w:hAnsi="Arial"/>
+                <w:color w:val="1A1A1A"/>
+                <w:sz w:val="22"/>
+                <w:szCs w:val="22"/>
+              </w:rPr>
+              <w:t xml:space="preserve">Stuck job watchdog — a background process polls every 60 seconds and automatically marks any job that has been in an active pipeline state for more than 45 minutes as FAILED. This prevents jobs from spinning indefinitely after a server disruption.</w:t>
+            </w:r>
+          </w:p>
+        </w:tc>
+      </w:tr>
     </w:tbl>
     <w:p>
       <w:pPr>
@@ -8525,6 +8663,240 @@
     </w:p>
     <w:p>
       <w:pPr>
+        <w:spacing w:after="80" w:before="60"/>
+      </w:pPr>
+      <w:r>
+        <w:rPr>
+          <w:rFonts w:ascii="Arial" w:cs="Arial" w:eastAsia="Arial" w:hAnsi="Arial"/>
+          <w:color w:val="1A1A1A"/>
+          <w:sz w:val="22"/>
+          <w:szCs w:val="22"/>
+        </w:rPr>
+        <w:t xml:space="preserve">If an individual batch job crashes unexpectedly (network error, out-of-memory, unhandled exception), the tool now catches the failure, marks that job FAILED in the database, and pushes a FAILED status event to the progress stream. The remaining jobs in the batch continue running unaffected. The batch status page will show PARTIAL if at least one job completed successfully alongside failures — review the Log Archive for each failed job to diagnose and re-submit individually.</w:t>
+      </w:r>
+    </w:p>
+    <w:p>
+      <w:pPr>
+        <w:spacing w:after="0" w:before="100"/>
+      </w:pPr>
+    </w:p>
+    <w:p>
+      <w:pPr>
+        <w:pStyle w:val="Heading2"/>
+        <w:spacing w:after="120" w:before="240"/>
+      </w:pPr>
+      <w:r>
+        <w:rPr>
+          <w:rFonts w:ascii="Arial" w:cs="Arial" w:eastAsia="Arial" w:hAnsi="Arial"/>
+          <w:b/>
+          <w:bCs/>
+          <w:color w:val="2E75B6"/>
+          <w:sz w:val="26"/>
+          <w:szCs w:val="26"/>
+        </w:rPr>
+        <w:t xml:space="preserve">Manifest Download</w:t>
+      </w:r>
+    </w:p>
+    <w:p>
+      <w:pPr>
+        <w:spacing w:after="80" w:before="60"/>
+      </w:pPr>
+      <w:r>
+        <w:rPr>
+          <w:rFonts w:ascii="Arial" w:cs="Arial" w:eastAsia="Arial" w:hAnsi="Arial"/>
+          <w:color w:val="1A1A1A"/>
+          <w:sz w:val="22"/>
+          <w:szCs w:val="22"/>
+        </w:rPr>
+        <w:t xml:space="preserve">After Step 1 (Parse) completes, a ↗ Manifest button appears in the job panel header. Clicking it downloads a structured XLSX workbook listing every transformation found in the mapping — its type, name, source ports, target ports, filter condition, join condition, and any SQL overrides. The manifest is generated on demand and does not consume storage in the job database.</w:t>
+      </w:r>
+    </w:p>
+    <w:p>
+      <w:pPr>
+        <w:spacing w:after="80" w:before="60"/>
+      </w:pPr>
+      <w:r>
+        <w:rPr>
+          <w:rFonts w:ascii="Arial" w:cs="Arial" w:eastAsia="Arial" w:hAnsi="Arial"/>
+          <w:color w:val="1A1A1A"/>
+          <w:sz w:val="22"/>
+          <w:szCs w:val="22"/>
+        </w:rPr>
+        <w:t xml:space="preserve">Use the manifest before Gate 1 to cross-check that the parser has captured all transformations you expect from the mapping. If a transformation is missing or its ports look wrong, it is faster to fix the source XML and re-upload than to discover the gap after conversion.</w:t>
+      </w:r>
+    </w:p>
+    <w:p>
+      <w:pPr>
+        <w:spacing w:after="0" w:before="100"/>
+      </w:pPr>
+    </w:p>
+    <w:p>
+      <w:pPr>
+        <w:pStyle w:val="Heading2"/>
+        <w:spacing w:after="120" w:before="240"/>
+      </w:pPr>
+      <w:r>
+        <w:rPr>
+          <w:rFonts w:ascii="Arial" w:cs="Arial" w:eastAsia="Arial" w:hAnsi="Arial"/>
+          <w:b/>
+          <w:bCs/>
+          <w:color w:val="2E75B6"/>
+          <w:sz w:val="26"/>
+          <w:szCs w:val="26"/>
+        </w:rPr>
+        <w:t xml:space="preserve">Manifest Reviewer Overrides</w:t>
+      </w:r>
+    </w:p>
+    <w:p>
+      <w:pPr>
+        <w:spacing w:after="80" w:before="60"/>
+      </w:pPr>
+      <w:r>
+        <w:rPr>
+          <w:rFonts w:ascii="Arial" w:cs="Arial" w:eastAsia="Arial" w:hAnsi="Arial"/>
+          <w:color w:val="1A1A1A"/>
+          <w:sz w:val="22"/>
+          <w:szCs w:val="22"/>
+        </w:rPr>
+        <w:t xml:space="preserve">When the manifest contains rows on the Review Required sheet (LOW-confidence or UNMAPPED fields), reviewers can resolve them before conversion begins — without restarting the job. Download the manifest, fill in the Reviewer Override column for each row that needs guidance, and re-upload the annotated file before submitting Gate 1 sign-off.</w:t>
+      </w:r>
+    </w:p>
+    <w:p>
+      <w:pPr>
+        <w:spacing w:after="80" w:before="60"/>
+      </w:pPr>
+      <w:r>
+        <w:rPr>
+          <w:rFonts w:ascii="Arial" w:cs="Arial" w:eastAsia="Arial" w:hAnsi="Arial"/>
+          <w:color w:val="1A1A1A"/>
+          <w:sz w:val="22"/>
+          <w:szCs w:val="22"/>
+        </w:rPr>
+        <w:t xml:space="preserve">The upload section appears in the Gate 1 sign-off card as an amber MANIFEST OVERRIDES panel. Use the file picker to select the annotated .xlsx, then click Upload Overrides. A confirmation shows the number of overrides stored (e.g. "3 overrides stored"). The panel accepts only .xlsx files and rejects empty uploads.</w:t>
+      </w:r>
+    </w:p>
+    <w:p>
+      <w:pPr>
+        <w:spacing w:after="80" w:before="60"/>
+      </w:pPr>
+      <w:r>
+        <w:rPr>
+          <w:rFonts w:ascii="Arial" w:cs="Arial" w:eastAsia="Arial" w:hAnsi="Arial"/>
+          <w:color w:val="1A1A1A"/>
+          <w:sz w:val="22"/>
+          <w:szCs w:val="22"/>
+        </w:rPr>
+        <w:t xml:space="preserve">Once uploaded, overrides are stored with the job and automatically injected into the conversion agent prompt as authoritative ground truth. The conversion agent treats each override as a confirmed mapping decision and will not second-guess it. If the uploaded file contains no Override column values, the status message directs the reviewer to check the Review Required sheet rather than accepting a silent empty upload.</w:t>
+      </w:r>
+    </w:p>
+    <w:p>
+      <w:pPr>
+        <w:pStyle w:val="ListParagraph"/>
+        <w:numPr>
+          <w:ilvl w:val="0"/>
+          <w:numId w:val="1"/>
+        </w:numPr>
+        <w:spacing w:after="40" w:before="40"/>
+      </w:pPr>
+      <w:r>
+        <w:rPr>
+          <w:rFonts w:ascii="Arial" w:cs="Arial" w:eastAsia="Arial" w:hAnsi="Arial"/>
+          <w:b/>
+          <w:bCs/>
+          <w:color w:val="1A1A1A"/>
+          <w:sz w:val="22"/>
+          <w:szCs w:val="22"/>
+        </w:rPr>
+        <w:t xml:space="preserve">Download manifest</w:t>
+      </w:r>
+      <w:r>
+        <w:rPr>
+          <w:rFonts w:ascii="Arial" w:cs="Arial" w:eastAsia="Arial" w:hAnsi="Arial"/>
+          <w:color w:val="1A1A1A"/>
+          <w:sz w:val="22"/>
+          <w:szCs w:val="22"/>
+        </w:rPr>
+        <w:t xml:space="preserve"> — click the ↗ Manifest button after Step 1 to get the workbook.</w:t>
+      </w:r>
+    </w:p>
+    <w:p>
+      <w:pPr>
+        <w:pStyle w:val="ListParagraph"/>
+        <w:numPr>
+          <w:ilvl w:val="0"/>
+          <w:numId w:val="1"/>
+        </w:numPr>
+        <w:spacing w:after="40" w:before="40"/>
+      </w:pPr>
+      <w:r>
+        <w:rPr>
+          <w:rFonts w:ascii="Arial" w:cs="Arial" w:eastAsia="Arial" w:hAnsi="Arial"/>
+          <w:color w:val="1A1A1A"/>
+          <w:sz w:val="22"/>
+          <w:szCs w:val="22"/>
+        </w:rPr>
+        <w:t xml:space="preserve">Open the Review Required sheet — rows with LOW confidence or UNMAPPED status appear here.</w:t>
+      </w:r>
+    </w:p>
+    <w:p>
+      <w:pPr>
+        <w:pStyle w:val="ListParagraph"/>
+        <w:numPr>
+          <w:ilvl w:val="0"/>
+          <w:numId w:val="1"/>
+        </w:numPr>
+        <w:spacing w:after="40" w:before="40"/>
+      </w:pPr>
+      <w:r>
+        <w:rPr>
+          <w:rFonts w:ascii="Arial" w:cs="Arial" w:eastAsia="Arial" w:hAnsi="Arial"/>
+          <w:color w:val="1A1A1A"/>
+          <w:sz w:val="22"/>
+          <w:szCs w:val="22"/>
+        </w:rPr>
+        <w:t xml:space="preserve">Fill in the Reviewer Override column for each row you want to resolve. Leave rows blank if you are comfortable with the tool’s default mapping.</w:t>
+      </w:r>
+    </w:p>
+    <w:p>
+      <w:pPr>
+        <w:pStyle w:val="ListParagraph"/>
+        <w:numPr>
+          <w:ilvl w:val="0"/>
+          <w:numId w:val="1"/>
+        </w:numPr>
+        <w:spacing w:after="40" w:before="40"/>
+      </w:pPr>
+      <w:r>
+        <w:rPr>
+          <w:rFonts w:ascii="Arial" w:cs="Arial" w:eastAsia="Arial" w:hAnsi="Arial"/>
+          <w:color w:val="1A1A1A"/>
+          <w:sz w:val="22"/>
+          <w:szCs w:val="22"/>
+        </w:rPr>
+        <w:t xml:space="preserve">Upload in the Gate 1 card — use the MANIFEST OVERRIDES panel to re-upload the annotated file before submitting sign-off.</w:t>
+      </w:r>
+    </w:p>
+    <w:p>
+      <w:pPr>
+        <w:pStyle w:val="ListParagraph"/>
+        <w:numPr>
+          <w:ilvl w:val="0"/>
+          <w:numId w:val="1"/>
+        </w:numPr>
+        <w:spacing w:after="40" w:before="40"/>
+      </w:pPr>
+      <w:r>
+        <w:rPr>
+          <w:rFonts w:ascii="Arial" w:cs="Arial" w:eastAsia="Arial" w:hAnsi="Arial"/>
+          <w:color w:val="1A1A1A"/>
+          <w:sz w:val="22"/>
+          <w:szCs w:val="22"/>
+        </w:rPr>
+        <w:t xml:space="preserve">Submit Gate 1 — the conversion agent automatically picks up the stored overrides when conversion begins.</w:t>
+      </w:r>
+    </w:p>
+    <w:p>
+      <w:pPr>
         <w:spacing w:after="0" w:before="100"/>
       </w:pPr>
     </w:p>
@@ -9461,7 +9833,7 @@
                 <w:sz w:val="22"/>
                 <w:szCs w:val="22"/>
               </w:rPr>
-              <w:t xml:space="preserve">  •  Informatica Conversion Tool v2.3.5  •  CC BY-NC 4.0</w:t>
+              <w:t xml:space="preserve">  •  Informatica Conversion Tool v2.4.9  •  CC BY-NC 4.0</w:t>
             </w:r>
           </w:p>
         </w:tc>

</xml_diff>

<commit_message>
feat(export): job artifact export to disk + ZIP download (v2.5.0)
On Gate 3 COMPLETE, job_exporter.py writes all job artifacts to
OUTPUT_DIR/<job_id>/ — input/ (all uploaded source files), output/
(generated code + tests), docs/ (documentation, S2T workbook, manifest,
verification report, security scan), logs/ (pipeline log). Export is
non-fatal and never blocks pipeline completion.

New GET /jobs/{job_id}/output.zip endpoint bundles all conversion output
files into a ZIP preserving folder structure. Built directly from DB
state so it works without a prior disk export. Prominent "⬇ Download ZIP"
button added to the UI output panel.

New OUTPUT_DIR config setting (defaults to <repo_root>/jobs/, set to
"disabled" to suppress disk writes while keeping ZIP download functional).

Co-Authored-By: Claude Sonnet 4.6 <noreply@anthropic.com>
</commit_message>
<xml_diff>
--- a/docs/Informatica Conversion Tool - Best Practices Guide.docx
+++ b/docs/Informatica Conversion Tool - Best Practices Guide.docx
@@ -76,7 +76,7 @@
                 <w:sz w:val="18"/>
                 <w:szCs w:val="18"/>
               </w:rPr>
-              <w:t xml:space="preserve">Version 2.4.9  •  For Data Migration Engineers and Reviewers</w:t>
+              <w:t xml:space="preserve">Version 2.5.0  •  For Data Migration Engineers and Reviewers</w:t>
             </w:r>
           </w:p>
         </w:tc>
@@ -8575,6 +8575,75 @@
     </w:p>
     <w:p>
       <w:pPr>
+        <w:spacing w:after="0" w:before="100"/>
+      </w:pPr>
+    </w:p>
+    <w:p>
+      <w:pPr>
+        <w:pStyle w:val="Heading2"/>
+        <w:spacing w:after="120" w:before="240"/>
+      </w:pPr>
+      <w:r>
+        <w:rPr>
+          <w:rFonts w:ascii="Arial" w:cs="Arial" w:eastAsia="Arial" w:hAnsi="Arial"/>
+          <w:b/>
+          <w:bCs/>
+          <w:color w:val="2E75B6"/>
+          <w:sz w:val="26"/>
+          <w:szCs w:val="26"/>
+        </w:rPr>
+        <w:t xml:space="preserve">Job Artifact Export</w:t>
+      </w:r>
+    </w:p>
+    <w:p>
+      <w:pPr>
+        <w:spacing w:after="80" w:before="60"/>
+      </w:pPr>
+      <w:r>
+        <w:rPr>
+          <w:rFonts w:ascii="Arial" w:cs="Arial" w:eastAsia="Arial" w:hAnsi="Arial"/>
+          <w:color w:val="1A1A1A"/>
+          <w:sz w:val="22"/>
+          <w:szCs w:val="22"/>
+        </w:rPr>
+        <w:t xml:space="preserve">When a job reaches pipeline COMPLETE (Gate 3 approved), the tool automatically writes all job artifacts to OUTPUT_DIR/&lt;job_id&gt;/ on disk. The folder contains four subdirectories: input/ holds all uploaded source files (mapping XML, workflow XML, parameter file); output/ holds all generated code files preserving their folder structure, plus a tests/ subfolder for generated test files; docs/ holds the documentation report, S2T workbook, manifest, verification report, and security scan findings; logs/ holds the full pipeline log.</w:t>
+      </w:r>
+    </w:p>
+    <w:p>
+      <w:pPr>
+        <w:spacing w:after="80" w:before="60"/>
+      </w:pPr>
+      <w:r>
+        <w:rPr>
+          <w:rFonts w:ascii="Arial" w:cs="Arial" w:eastAsia="Arial" w:hAnsi="Arial"/>
+          <w:color w:val="1A1A1A"/>
+          <w:sz w:val="22"/>
+          <w:szCs w:val="22"/>
+        </w:rPr>
+        <w:t xml:space="preserve">Set OUTPUT_DIR in your .env file to control the export location. Leave it empty to use the default &lt;repo_root&gt;/jobs/ directory. Set it to an absolute path for Docker or CI deployments where the working directory may vary. Set it to disabled to suppress disk writes entirely — the ZIP download endpoint remains functional regardless.</w:t>
+      </w:r>
+    </w:p>
+    <w:p>
+      <w:pPr>
+        <w:spacing w:after="80" w:before="60"/>
+      </w:pPr>
+      <w:r>
+        <w:rPr>
+          <w:rFonts w:ascii="Arial" w:cs="Arial" w:eastAsia="Arial" w:hAnsi="Arial"/>
+          <w:color w:val="1A1A1A"/>
+          <w:sz w:val="22"/>
+          <w:szCs w:val="22"/>
+        </w:rPr>
+        <w:t xml:space="preserve">To get the output files without waiting for Gate 3, or when running the tool on a remote server, use the Download ZIP button in the output panel. It fetches GET /jobs/{job_id}/output.zip which bundles all generated code files into a single ZIP archive preserving folder structure. The ZIP contains output files only — for the full job folder including docs and logs, use the disk export.</w:t>
+      </w:r>
+    </w:p>
+    <w:p>
+      <w:pPr>
+        <w:spacing w:after="0" w:before="100"/>
+      </w:pPr>
+    </w:p>
+    <w:p>
+      <w:pPr>
         <w:pStyle w:val="Heading2"/>
         <w:spacing w:after="120" w:before="240"/>
       </w:pPr>
@@ -9833,7 +9902,7 @@
                 <w:sz w:val="22"/>
                 <w:szCs w:val="22"/>
               </w:rPr>
-              <w:t xml:space="preserve">  •  Informatica Conversion Tool v2.4.9  •  CC BY-NC 4.0</w:t>
+              <w:t xml:space="preserve">  •  Informatica Conversion Tool v2.5.0  •  CC BY-NC 4.0</w:t>
             </w:r>
           </w:p>
         </w:tc>

</xml_diff>

<commit_message>
docs + chore(schemas): BPG v2.6.1 security section + schema_version on all persisted models
- docs/Changelog.docx: add v2.6.1 entry (CRITICAL/HIGH/MEDIUM security fixes)
- docs/Best Practices Guide.docx: add Section 11 — Security Hardening v2.6.1
  Operator Notes (required .env settings, new config vars, other hardening changes)
- app/backend/models/schemas.py: add schema_version: int = 1 (with default) to all
  14 models that are persisted in state_json — ParseReport, ComplexityReport,
  VerificationReport, SessionParseReport, ConversionOutput, SecurityScanReport,
  CodeReviewReport, TestReport, ReconciliationReport, SignOffRecord,
  SecuritySignOffRecord, CodeSignOffRecord, StackAssignment, ManifestReport.
  Old rows without the field deserialise safely (Pydantic fills in default=1).
  Future devs: bump the version + add a migration block in the orchestrator when
  adding a breaking change to any of these schemas.

Co-Authored-By: Claude Sonnet 4.6 <noreply@anthropic.com>
</commit_message>
<xml_diff>
--- a/docs/Informatica Conversion Tool - Best Practices Guide.docx
+++ b/docs/Informatica Conversion Tool - Best Practices Guide.docx
@@ -9225,7 +9225,270 @@
           <w:sz w:val="32"/>
           <w:szCs w:val="32"/>
         </w:rPr>
-        <w:t xml:space="preserve">11. Quick Reference — Flag Severity Guide</w:t>
+        <w:t xml:space="preserve">11. Security Hardening — v2.6.1 Operator Notes</w:t>
+      </w:r>
+    </w:p>
+    <w:p>
+      <w:pPr>
+        <w:pBdr>
+          <w:bottom w:val="single" w:color="D5E8F0" w:sz="4" w:space="1"/>
+        </w:pBdr>
+        <w:spacing w:after="200" w:before="200"/>
+      </w:pPr>
+    </w:p>
+    <w:p>
+      <w:pPr>
+        <w:pStyle w:val="Heading2"/>
+        <w:spacing w:after="120" w:before="240"/>
+      </w:pPr>
+      <w:r>
+        <w:rPr>
+          <w:rFonts w:ascii="Arial" w:cs="Arial" w:eastAsia="Arial" w:hAnsi="Arial"/>
+          <w:b/>
+          <w:bCs/>
+          <w:color w:val="1E3A5F"/>
+          <w:sz w:val="26"/>
+          <w:szCs w:val="26"/>
+        </w:rPr>
+        <w:t xml:space="preserve">11.1 Required .env Settings for Production</w:t>
+      </w:r>
+    </w:p>
+    <w:p>
+      <w:pPr>
+        <w:spacing w:after="80" w:before="60"/>
+      </w:pPr>
+      <w:r>
+        <w:rPr>
+          <w:rFonts w:ascii="Arial" w:cs="Arial" w:eastAsia="Arial" w:hAnsi="Arial"/>
+          <w:color w:val="1A1A1A"/>
+          <w:sz w:val="22"/>
+          <w:szCs w:val="22"/>
+        </w:rPr>
+        <w:t xml:space="preserve">v2.6.1 introduces a hard startup failure if SECRET_KEY is the default placeholder while APP_PASSWORD is set. Before deploying to any non-local environment, ensure your .env contains all three of the following:</w:t>
+      </w:r>
+    </w:p>
+    <w:p>
+      <w:pPr>
+        <w:spacing w:after="60" w:before="120"/>
+        <w:ind w:left="720"/>
+      </w:pPr>
+      <w:r>
+        <w:rPr>
+          <w:rFonts w:ascii="Courier New" w:cs="Courier New" w:eastAsia="Courier New" w:hAnsi="Courier New"/>
+          <w:color w:val="1E3A5F"/>
+          <w:sz w:val="20"/>
+          <w:szCs w:val="20"/>
+        </w:rPr>
+        <w:t xml:space="preserve">APP_PASSWORD=your-strong-password</w:t>
+      </w:r>
+    </w:p>
+    <w:p>
+      <w:pPr>
+        <w:spacing w:after="60" w:before="0"/>
+        <w:ind w:left="720"/>
+      </w:pPr>
+      <w:r>
+        <w:rPr>
+          <w:rFonts w:ascii="Courier New" w:cs="Courier New" w:eastAsia="Courier New" w:hAnsi="Courier New"/>
+          <w:color w:val="1E3A5F"/>
+          <w:sz w:val="20"/>
+          <w:szCs w:val="20"/>
+        </w:rPr>
+        <w:t xml:space="preserve">SECRET_KEY=&lt;output of: python -c "import secrets; print(secrets.token_hex(32))"&gt;</w:t>
+      </w:r>
+    </w:p>
+    <w:p>
+      <w:pPr>
+        <w:spacing w:after="100" w:before="0"/>
+        <w:ind w:left="720"/>
+      </w:pPr>
+      <w:r>
+        <w:rPr>
+          <w:rFonts w:ascii="Courier New" w:cs="Courier New" w:eastAsia="Courier New" w:hAnsi="Courier New"/>
+          <w:color w:val="1E3A5F"/>
+          <w:sz w:val="20"/>
+          <w:szCs w:val="20"/>
+        </w:rPr>
+        <w:t xml:space="preserve">ANTHROPIC_API_KEY=sk-ant-...</w:t>
+      </w:r>
+    </w:p>
+    <w:p>
+      <w:pPr>
+        <w:spacing w:after="80" w:before="60"/>
+      </w:pPr>
+      <w:r>
+        <w:rPr>
+          <w:rFonts w:ascii="Arial" w:cs="Arial" w:eastAsia="Arial" w:hAnsi="Arial"/>
+          <w:color w:val="1A1A1A"/>
+          <w:sz w:val="22"/>
+          <w:szCs w:val="22"/>
+        </w:rPr>
+        <w:t xml:space="preserve">If SECRET_KEY is the default value and APP_PASSWORD is set, the server will refuse to start with a FATAL error. This is intentional — it prevents token forgery in any password-protected deployment. In dev mode (no APP_PASSWORD), the default key produces a warning only and the server starts normally.</w:t>
+      </w:r>
+    </w:p>
+    <w:p>
+      <w:pPr>
+        <w:pStyle w:val="Heading2"/>
+        <w:spacing w:after="120" w:before="240"/>
+      </w:pPr>
+      <w:r>
+        <w:rPr>
+          <w:rFonts w:ascii="Arial" w:cs="Arial" w:eastAsia="Arial" w:hAnsi="Arial"/>
+          <w:b/>
+          <w:bCs/>
+          <w:color w:val="1E3A5F"/>
+          <w:sz w:val="26"/>
+          <w:szCs w:val="26"/>
+        </w:rPr>
+        <w:t xml:space="preserve">11.2 New Configuration Variables (v2.6.1)</w:t>
+      </w:r>
+    </w:p>
+    <w:p>
+      <w:pPr>
+        <w:spacing w:after="80" w:before="60"/>
+      </w:pPr>
+      <w:r>
+        <w:rPr>
+          <w:rFonts w:ascii="Arial" w:cs="Arial" w:eastAsia="Arial" w:hAnsi="Arial"/>
+          <w:color w:val="1A1A1A"/>
+          <w:sz w:val="22"/>
+          <w:szCs w:val="22"/>
+        </w:rPr>
+        <w:t xml:space="preserve">Three new optional .env variables are available in v2.6.1. All are optional with safe defaults:</w:t>
+      </w:r>
+    </w:p>
+    <w:p>
+      <w:pPr>
+        <w:spacing w:after="60" w:before="120"/>
+        <w:ind w:left="360"/>
+      </w:pPr>
+      <w:r>
+        <w:rPr>
+          <w:rFonts w:ascii="Courier New" w:cs="Courier New" w:eastAsia="Courier New" w:hAnsi="Courier New"/>
+          <w:b/>
+          <w:bCs/>
+          <w:color w:val="1E3A5F"/>
+          <w:sz w:val="20"/>
+          <w:szCs w:val="20"/>
+        </w:rPr>
+        <w:t xml:space="preserve">BCRYPT_ROUNDS</w:t>
+      </w:r>
+      <w:r>
+        <w:rPr>
+          <w:rFonts w:ascii="Arial" w:cs="Arial" w:eastAsia="Arial" w:hAnsi="Arial"/>
+          <w:color w:val="1A1A1A"/>
+          <w:sz w:val="22"/>
+          <w:szCs w:val="22"/>
+        </w:rPr>
+        <w:t xml:space="preserve"> (default: 12) — bcrypt work factor for password hashing. Increase to 13–14 on high-memory servers for stronger brute-force resistance.</w:t>
+      </w:r>
+    </w:p>
+    <w:p>
+      <w:pPr>
+        <w:spacing w:after="60" w:before="0"/>
+        <w:ind w:left="360"/>
+      </w:pPr>
+      <w:r>
+        <w:rPr>
+          <w:rFonts w:ascii="Courier New" w:cs="Courier New" w:eastAsia="Courier New" w:hAnsi="Courier New"/>
+          <w:b/>
+          <w:bCs/>
+          <w:color w:val="1E3A5F"/>
+          <w:sz w:val="20"/>
+          <w:szCs w:val="20"/>
+        </w:rPr>
+        <w:t xml:space="preserve">AGENT_TIMEOUT_SECS</w:t>
+      </w:r>
+      <w:r>
+        <w:rPr>
+          <w:rFonts w:ascii="Arial" w:cs="Arial" w:eastAsia="Arial" w:hAnsi="Arial"/>
+          <w:color w:val="1A1A1A"/>
+          <w:sz w:val="22"/>
+          <w:szCs w:val="22"/>
+        </w:rPr>
+        <w:t xml:space="preserve"> (default: 300) — hard per-call timeout in seconds applied to every Claude API call. Prevents pipeline hangs if the Anthropic API becomes unresponsive. Lower to 120 for faster failure in CI environments.</w:t>
+      </w:r>
+    </w:p>
+    <w:p>
+      <w:pPr>
+        <w:spacing w:after="100" w:before="0"/>
+        <w:ind w:left="360"/>
+      </w:pPr>
+      <w:r>
+        <w:rPr>
+          <w:rFonts w:ascii="Courier New" w:cs="Courier New" w:eastAsia="Courier New" w:hAnsi="Courier New"/>
+          <w:b/>
+          <w:bCs/>
+          <w:color w:val="1E3A5F"/>
+          <w:sz w:val="20"/>
+          <w:szCs w:val="20"/>
+        </w:rPr>
+        <w:t xml:space="preserve">EXTENDED_OUTPUT_BETA</w:t>
+      </w:r>
+      <w:r>
+        <w:rPr>
+          <w:rFonts w:ascii="Arial" w:cs="Arial" w:eastAsia="Arial" w:hAnsi="Arial"/>
+          <w:color w:val="1A1A1A"/>
+          <w:sz w:val="22"/>
+          <w:szCs w:val="22"/>
+        </w:rPr>
+        <w:t xml:space="preserve"> (default: output-128k-2025-02-19) — Anthropic beta header used by the documentation agent for 64k-token output. Update when Anthropic releases a newer beta string.</w:t>
+      </w:r>
+    </w:p>
+    <w:p>
+      <w:pPr>
+        <w:pStyle w:val="Heading2"/>
+        <w:spacing w:after="120" w:before="240"/>
+      </w:pPr>
+      <w:r>
+        <w:rPr>
+          <w:rFonts w:ascii="Arial" w:cs="Arial" w:eastAsia="Arial" w:hAnsi="Arial"/>
+          <w:b/>
+          <w:bCs/>
+          <w:color w:val="1E3A5F"/>
+          <w:sz w:val="26"/>
+          <w:szCs w:val="26"/>
+        </w:rPr>
+        <w:t xml:space="preserve">11.3 Other Hardening Changes in v2.6.1</w:t>
+      </w:r>
+    </w:p>
+    <w:p>
+      <w:pPr>
+        <w:spacing w:after="80" w:before="60"/>
+      </w:pPr>
+      <w:r>
+        <w:rPr>
+          <w:rFonts w:ascii="Arial" w:cs="Arial" w:eastAsia="Arial" w:hAnsi="Arial"/>
+          <w:color w:val="1A1A1A"/>
+          <w:sz w:val="22"/>
+          <w:szCs w:val="22"/>
+        </w:rPr>
+        <w:t xml:space="preserve">These changes are transparent to normal use but are documented for operators and security reviewers. The rate limiter now holds an asyncio.Lock so concurrent requests cannot simultaneously bypass the per-IP threshold. Temporary files written for bandit scans are now created with 0o600 permissions (owner read/write only) rather than the previous world-readable 0o644. All 16 job ID path parameters are validated as UUIDs on every request — malformed IDs return HTTP 400 before any database access occurs. File uploads now validate the declared content-type against an allow-list (XML types for mapping uploads, ZIP types for batch uploads), returning HTTP 415 on mismatch. The startup API probe now distinguishes authentication errors from transient network failures: a bad API key logs a persistent ERROR rather than being silently swallowed. WAL journal mode is validated at startup and a warning is emitted if the database filesystem does not support it.</w:t>
+      </w:r>
+    </w:p>
+    <w:p>
+      <w:pPr>
+        <w:pBdr>
+          <w:bottom w:val="single" w:color="D5E8F0" w:sz="4" w:space="1"/>
+        </w:pBdr>
+        <w:spacing w:after="200" w:before="200"/>
+      </w:pPr>
+    </w:p>
+    <w:p>
+      <w:pPr>
+        <w:pStyle w:val="Heading1"/>
+        <w:spacing w:after="160" w:before="320"/>
+      </w:pPr>
+      <w:r>
+        <w:rPr>
+          <w:rFonts w:ascii="Arial" w:cs="Arial" w:eastAsia="Arial" w:hAnsi="Arial"/>
+          <w:b/>
+          <w:bCs/>
+          <w:color w:val="1F4E79"/>
+          <w:sz w:val="32"/>
+          <w:szCs w:val="32"/>
+        </w:rPr>
+        <w:t xml:space="preserve">12. Quick Reference — Flag Severity Guide</w:t>
       </w:r>
     </w:p>
     <w:p>

</xml_diff>

<commit_message>
docs: v2.7.0 — dbt execution-ready output in Changelog + BPG
Changelog.docx:
- New v2.7.0 entry (green FEAT border) documenting the full execution-ready
  dbt output: EL script, orchestration wrapper, profiles.yml, requirements.txt

Best Practices Guide.docx:
- New Section 12 "dbt Output — Running in an Enterprise (v2.7.0)"
  12.1 What the Tool Generates for dbt Jobs (six artifact groups)
  12.2 How to Run a dbt Conversion Output (four operator steps)
  12.3 Enterprise Scheduling (exit-code contract, Airflow/ADF/Prefect/cron)
- Former Section 12 (Quick Reference) renumbered to Section 13

Co-Authored-By: Claude Sonnet 4.6 <noreply@anthropic.com>
</commit_message>
<xml_diff>
--- a/docs/Informatica Conversion Tool - Best Practices Guide.docx
+++ b/docs/Informatica Conversion Tool - Best Practices Guide.docx
@@ -9476,6 +9476,14 @@
     </w:p>
     <w:p>
       <w:pPr>
+        <w:pBdr>
+          <w:bottom w:val="single" w:color="D5E8F0" w:sz="4" w:space="1"/>
+        </w:pBdr>
+        <w:spacing w:after="200" w:before="200"/>
+      </w:pPr>
+    </w:p>
+    <w:p>
+      <w:pPr>
         <w:pStyle w:val="Heading1"/>
         <w:spacing w:after="160" w:before="320"/>
       </w:pPr>
@@ -9488,7 +9496,404 @@
           <w:sz w:val="32"/>
           <w:szCs w:val="32"/>
         </w:rPr>
-        <w:t xml:space="preserve">12. Quick Reference — Flag Severity Guide</w:t>
+        <w:t xml:space="preserve">12. dbt Output — Running in an Enterprise (v2.7.0)</w:t>
+      </w:r>
+    </w:p>
+    <w:p>
+      <w:pPr>
+        <w:pBdr>
+          <w:bottom w:val="single" w:color="D5E8F0" w:sz="4" w:space="1"/>
+        </w:pBdr>
+        <w:spacing w:after="200" w:before="200"/>
+      </w:pPr>
+    </w:p>
+    <w:p>
+      <w:pPr>
+        <w:spacing w:after="80" w:before="60"/>
+      </w:pPr>
+      <w:r>
+        <w:rPr>
+          <w:rFonts w:ascii="Arial" w:cs="Arial" w:eastAsia="Arial" w:hAnsi="Arial"/>
+          <w:color w:val="1A1A1A"/>
+          <w:sz w:val="22"/>
+          <w:szCs w:val="22"/>
+        </w:rPr>
+        <w:t xml:space="preserve">From v2.7.0, every dbt job produces a fully execution-ready package. dbt only handles the transformation layer (T in ETL). In an enterprise the extraction and load steps, connection profiles, and orchestration must all exist before “dbt run” can be invoked. The tool now generates all of this automatically.</w:t>
+      </w:r>
+    </w:p>
+    <w:p>
+      <w:pPr>
+        <w:pStyle w:val="Heading2"/>
+        <w:spacing w:after="120" w:before="240"/>
+      </w:pPr>
+      <w:r>
+        <w:rPr>
+          <w:rFonts w:ascii="Arial" w:cs="Arial" w:eastAsia="Arial" w:hAnsi="Arial"/>
+          <w:b/>
+          <w:bCs/>
+          <w:color w:val="1E3A5F"/>
+          <w:sz w:val="26"/>
+          <w:szCs w:val="26"/>
+        </w:rPr>
+        <w:t xml:space="preserve">12.1 What the Tool Generates for dbt Jobs</w:t>
+      </w:r>
+    </w:p>
+    <w:p>
+      <w:pPr>
+        <w:spacing w:after="80" w:before="60"/>
+      </w:pPr>
+      <w:r>
+        <w:rPr>
+          <w:rFonts w:ascii="Arial" w:cs="Arial" w:eastAsia="Arial" w:hAnsi="Arial"/>
+          <w:color w:val="1A1A1A"/>
+          <w:sz w:val="22"/>
+          <w:szCs w:val="22"/>
+        </w:rPr>
+        <w:t xml:space="preserve">Every dbt conversion now produces six artifact groups:</w:t>
+      </w:r>
+    </w:p>
+    <w:p>
+      <w:pPr>
+        <w:spacing w:after="60" w:before="40"/>
+        <w:ind w:left="360"/>
+      </w:pPr>
+      <w:r>
+        <w:rPr>
+          <w:rFonts w:ascii="Arial" w:cs="Arial" w:eastAsia="Arial" w:hAnsi="Arial"/>
+          <w:b/>
+          <w:bCs/>
+          <w:color w:val="1A1A2E"/>
+          <w:sz w:val="20"/>
+          <w:szCs w:val="20"/>
+        </w:rPr>
+        <w:t xml:space="preserve">models/ (SQL)</w:t>
+      </w:r>
+      <w:r>
+        <w:rPr>
+          <w:rFonts w:ascii="Arial" w:cs="Arial" w:eastAsia="Arial" w:hAnsi="Arial"/>
+          <w:color w:val="4B5563"/>
+          <w:sz w:val="20"/>
+          <w:szCs w:val="20"/>
+        </w:rPr>
+        <w:t xml:space="preserve"> — dbt SQL models, sources.yml, schema.yml, dbt_project.yml. The transformation layer (T).</w:t>
+      </w:r>
+    </w:p>
+    <w:p>
+      <w:pPr>
+        <w:spacing w:after="60" w:before="40"/>
+        <w:ind w:left="360"/>
+      </w:pPr>
+      <w:r>
+        <w:rPr>
+          <w:rFonts w:ascii="Arial" w:cs="Arial" w:eastAsia="Arial" w:hAnsi="Arial"/>
+          <w:b/>
+          <w:bCs/>
+          <w:color w:val="1A1A2E"/>
+          <w:sz w:val="20"/>
+          <w:szCs w:val="20"/>
+        </w:rPr>
+        <w:t xml:space="preserve">extract/extract_{mapping_name}.py</w:t>
+      </w:r>
+      <w:r>
+        <w:rPr>
+          <w:rFonts w:ascii="Arial" w:cs="Arial" w:eastAsia="Arial" w:hAnsi="Arial"/>
+          <w:color w:val="4B5563"/>
+          <w:sz w:val="20"/>
+          <w:szCs w:val="20"/>
+        </w:rPr>
+        <w:t xml:space="preserve"> — Python EL script. Reads source (JDBC or flat file) in chunks via SQLAlchemy/pandas. Writes to warehouse staging schema. Exits with code 1 on failure so the orchestration wrapper stops immediately.</w:t>
+      </w:r>
+    </w:p>
+    <w:p>
+      <w:pPr>
+        <w:spacing w:after="60" w:before="40"/>
+        <w:ind w:left="360"/>
+      </w:pPr>
+      <w:r>
+        <w:rPr>
+          <w:rFonts w:ascii="Arial" w:cs="Arial" w:eastAsia="Arial" w:hAnsi="Arial"/>
+          <w:b/>
+          <w:bCs/>
+          <w:color w:val="1A1A2E"/>
+          <w:sz w:val="20"/>
+          <w:szCs w:val="20"/>
+        </w:rPr>
+        <w:t xml:space="preserve">run_pipeline.py</w:t>
+      </w:r>
+      <w:r>
+        <w:rPr>
+          <w:rFonts w:ascii="Arial" w:cs="Arial" w:eastAsia="Arial" w:hAnsi="Arial"/>
+          <w:color w:val="4B5563"/>
+          <w:sz w:val="20"/>
+          <w:szCs w:val="20"/>
+        </w:rPr>
+        <w:t xml:space="preserve"> — Orchestration wrapper. Sequences EL → dbt run → dbt test via subprocess. Hard-stops on any step failure. Entry point: python run_pipeline.py.</w:t>
+      </w:r>
+    </w:p>
+    <w:p>
+      <w:pPr>
+        <w:spacing w:after="60" w:before="40"/>
+        <w:ind w:left="360"/>
+      </w:pPr>
+      <w:r>
+        <w:rPr>
+          <w:rFonts w:ascii="Arial" w:cs="Arial" w:eastAsia="Arial" w:hAnsi="Arial"/>
+          <w:b/>
+          <w:bCs/>
+          <w:color w:val="1A1A2E"/>
+          <w:sz w:val="20"/>
+          <w:szCs w:val="20"/>
+        </w:rPr>
+        <w:t xml:space="preserve">profiles.yml</w:t>
+      </w:r>
+      <w:r>
+        <w:rPr>
+          <w:rFonts w:ascii="Arial" w:cs="Arial" w:eastAsia="Arial" w:hAnsi="Arial"/>
+          <w:color w:val="4B5563"/>
+          <w:sz w:val="20"/>
+          <w:szCs w:val="20"/>
+        </w:rPr>
+        <w:t xml:space="preserve"> — dbt connection profile. Warehouse type is auto-detected from the session connection metadata (Postgres, Snowflake, Redshift, BigQuery, Databricks, SQL Server). All credentials use dbt’s env_var() — no hardcoded values.</w:t>
+      </w:r>
+    </w:p>
+    <w:p>
+      <w:pPr>
+        <w:spacing w:after="60" w:before="40"/>
+        <w:ind w:left="360"/>
+      </w:pPr>
+      <w:r>
+        <w:rPr>
+          <w:rFonts w:ascii="Arial" w:cs="Arial" w:eastAsia="Arial" w:hAnsi="Arial"/>
+          <w:b/>
+          <w:bCs/>
+          <w:color w:val="1A1A2E"/>
+          <w:sz w:val="20"/>
+          <w:szCs w:val="20"/>
+        </w:rPr>
+        <w:t xml:space="preserve">requirements.txt</w:t>
+      </w:r>
+      <w:r>
+        <w:rPr>
+          <w:rFonts w:ascii="Arial" w:cs="Arial" w:eastAsia="Arial" w:hAnsi="Arial"/>
+          <w:color w:val="4B5563"/>
+          <w:sz w:val="20"/>
+          <w:szCs w:val="20"/>
+        </w:rPr>
+        <w:t xml:space="preserve"> — Pinned dependencies: dbt-core, the correct warehouse adapter, pandas, sqlalchemy, python-dotenv. Install once with pip install -r requirements.txt.</w:t>
+      </w:r>
+    </w:p>
+    <w:p>
+      <w:pPr>
+        <w:spacing w:after="60" w:before="40"/>
+        <w:ind w:left="360"/>
+      </w:pPr>
+      <w:r>
+        <w:rPr>
+          <w:rFonts w:ascii="Arial" w:cs="Arial" w:eastAsia="Arial" w:hAnsi="Arial"/>
+          <w:b/>
+          <w:bCs/>
+          <w:color w:val="1A1A2E"/>
+          <w:sz w:val="20"/>
+          <w:szCs w:val="20"/>
+        </w:rPr>
+        <w:t xml:space="preserve">config/ (YAML)</w:t>
+      </w:r>
+      <w:r>
+        <w:rPr>
+          <w:rFonts w:ascii="Arial" w:cs="Arial" w:eastAsia="Arial" w:hAnsi="Arial"/>
+          <w:color w:val="4B5563"/>
+          <w:sz w:val="20"/>
+          <w:szCs w:val="20"/>
+        </w:rPr>
+        <w:t xml:space="preserve"> — connections.yaml and runtime_config.yaml (from Step 0 session parse, unchanged from v1.1).</w:t>
+      </w:r>
+    </w:p>
+    <w:p>
+      <w:pPr>
+        <w:pStyle w:val="Heading2"/>
+        <w:spacing w:after="120" w:before="240"/>
+      </w:pPr>
+      <w:r>
+        <w:rPr>
+          <w:rFonts w:ascii="Arial" w:cs="Arial" w:eastAsia="Arial" w:hAnsi="Arial"/>
+          <w:b/>
+          <w:bCs/>
+          <w:color w:val="1E3A5F"/>
+          <w:sz w:val="26"/>
+          <w:szCs w:val="26"/>
+        </w:rPr>
+        <w:t xml:space="preserve">12.2 How to Run a dbt Conversion Output</w:t>
+      </w:r>
+    </w:p>
+    <w:p>
+      <w:pPr>
+        <w:spacing w:after="80" w:before="60"/>
+      </w:pPr>
+      <w:r>
+        <w:rPr>
+          <w:rFonts w:ascii="Arial" w:cs="Arial" w:eastAsia="Arial" w:hAnsi="Arial"/>
+          <w:color w:val="1A1A1A"/>
+          <w:sz w:val="22"/>
+          <w:szCs w:val="22"/>
+        </w:rPr>
+        <w:t xml:space="preserve">After downloading the conversion output, the operator follows four steps:</w:t>
+      </w:r>
+    </w:p>
+    <w:p>
+      <w:pPr>
+        <w:spacing w:after="60" w:before="40"/>
+        <w:ind w:left="360"/>
+      </w:pPr>
+      <w:r>
+        <w:rPr>
+          <w:rFonts w:ascii="Arial" w:cs="Arial" w:eastAsia="Arial" w:hAnsi="Arial"/>
+          <w:b/>
+          <w:bCs/>
+          <w:color w:val="1A7A4A"/>
+          <w:sz w:val="20"/>
+          <w:szCs w:val="20"/>
+        </w:rPr>
+        <w:t xml:space="preserve">Step 1 — Install dependencies.</w:t>
+      </w:r>
+      <w:r>
+        <w:rPr>
+          <w:rFonts w:ascii="Arial" w:cs="Arial" w:eastAsia="Arial" w:hAnsi="Arial"/>
+          <w:color w:val="4B5563"/>
+          <w:sz w:val="20"/>
+          <w:szCs w:val="20"/>
+        </w:rPr>
+        <w:t xml:space="preserve"> Run: pip install -r requirements.txt</w:t>
+      </w:r>
+    </w:p>
+    <w:p>
+      <w:pPr>
+        <w:spacing w:after="60" w:before="40"/>
+        <w:ind w:left="360"/>
+      </w:pPr>
+      <w:r>
+        <w:rPr>
+          <w:rFonts w:ascii="Arial" w:cs="Arial" w:eastAsia="Arial" w:hAnsi="Arial"/>
+          <w:b/>
+          <w:bCs/>
+          <w:color w:val="1A7A4A"/>
+          <w:sz w:val="20"/>
+          <w:szCs w:val="20"/>
+        </w:rPr>
+        <w:t xml:space="preserve">Step 2 — Set environment variables.</w:t>
+      </w:r>
+      <w:r>
+        <w:rPr>
+          <w:rFonts w:ascii="Arial" w:cs="Arial" w:eastAsia="Arial" w:hAnsi="Arial"/>
+          <w:color w:val="4B5563"/>
+          <w:sz w:val="20"/>
+          <w:szCs w:val="20"/>
+        </w:rPr>
+        <w:t xml:space="preserve"> Open profiles.yml and set each env_var() referenced (host, user, password, database, schema). Use a .env file and python-dotenv or export them directly in the shell. Never hardcode credentials in profiles.yml.</w:t>
+      </w:r>
+    </w:p>
+    <w:p>
+      <w:pPr>
+        <w:spacing w:after="60" w:before="40"/>
+        <w:ind w:left="360"/>
+      </w:pPr>
+      <w:r>
+        <w:rPr>
+          <w:rFonts w:ascii="Arial" w:cs="Arial" w:eastAsia="Arial" w:hAnsi="Arial"/>
+          <w:b/>
+          <w:bCs/>
+          <w:color w:val="1A7A4A"/>
+          <w:sz w:val="20"/>
+          <w:szCs w:val="20"/>
+        </w:rPr>
+        <w:t xml:space="preserve">Step 3 — Review extract script.</w:t>
+      </w:r>
+      <w:r>
+        <w:rPr>
+          <w:rFonts w:ascii="Arial" w:cs="Arial" w:eastAsia="Arial" w:hAnsi="Arial"/>
+          <w:color w:val="4B5563"/>
+          <w:sz w:val="20"/>
+          <w:szCs w:val="20"/>
+        </w:rPr>
+        <w:t xml:space="preserve"> Open extract/extract_{mapping_name}.py. Verify the CONFIG dict at the top matches your environment (source JDBC URL, staging schema name, file paths). The script was generated from the mapping documentation — spot-check the source query and target table name against the original Informatica session config.</w:t>
+      </w:r>
+    </w:p>
+    <w:p>
+      <w:pPr>
+        <w:spacing w:after="60" w:before="40"/>
+        <w:ind w:left="360"/>
+      </w:pPr>
+      <w:r>
+        <w:rPr>
+          <w:rFonts w:ascii="Arial" w:cs="Arial" w:eastAsia="Arial" w:hAnsi="Arial"/>
+          <w:b/>
+          <w:bCs/>
+          <w:color w:val="1A7A4A"/>
+          <w:sz w:val="20"/>
+          <w:szCs w:val="20"/>
+        </w:rPr>
+        <w:t xml:space="preserve">Step 4 — Run the pipeline.</w:t>
+      </w:r>
+      <w:r>
+        <w:rPr>
+          <w:rFonts w:ascii="Arial" w:cs="Arial" w:eastAsia="Arial" w:hAnsi="Arial"/>
+          <w:color w:val="4B5563"/>
+          <w:sz w:val="20"/>
+          <w:szCs w:val="20"/>
+        </w:rPr>
+        <w:t xml:space="preserve"> Run: python run_pipeline.py. The wrapper executes EL → dbt run → dbt test in sequence. Any step failure stops the pipeline and exits with a non-zero code — compatible with Airflow, ADF, and cron-based schedulers.</w:t>
+      </w:r>
+    </w:p>
+    <w:p>
+      <w:pPr>
+        <w:pStyle w:val="Heading2"/>
+        <w:spacing w:after="120" w:before="240"/>
+      </w:pPr>
+      <w:r>
+        <w:rPr>
+          <w:rFonts w:ascii="Arial" w:cs="Arial" w:eastAsia="Arial" w:hAnsi="Arial"/>
+          <w:b/>
+          <w:bCs/>
+          <w:color w:val="1E3A5F"/>
+          <w:sz w:val="26"/>
+          <w:szCs w:val="26"/>
+        </w:rPr>
+        <w:t xml:space="preserve">12.3 Enterprise Scheduling</w:t>
+      </w:r>
+    </w:p>
+    <w:p>
+      <w:pPr>
+        <w:spacing w:after="80" w:before="60"/>
+      </w:pPr>
+      <w:r>
+        <w:rPr>
+          <w:rFonts w:ascii="Arial" w:cs="Arial" w:eastAsia="Arial" w:hAnsi="Arial"/>
+          <w:color w:val="1A1A1A"/>
+          <w:sz w:val="22"/>
+          <w:szCs w:val="22"/>
+        </w:rPr>
+        <w:t xml:space="preserve">run_pipeline.py is designed to be called from any enterprise scheduler. The exit-code contract (0 = success, non-zero = failure) is compatible with all major platforms: wrap it in an Airflow PythonOperator or BashOperator, an Azure Data Factory Custom Activity, a Prefect task, or a cron entry. For Airflow, set on_failure_callback to alert the appropriate team and do not set trigger_rule=“all_done” — let the default “all_success” rule propagate failures downstream.</w:t>
+      </w:r>
+    </w:p>
+    <w:p>
+      <w:pPr>
+        <w:spacing w:after="200" w:before="200"/>
+      </w:pPr>
+    </w:p>
+    <w:p>
+      <w:pPr>
+        <w:pStyle w:val="Heading1"/>
+        <w:spacing w:after="160" w:before="320"/>
+      </w:pPr>
+      <w:r>
+        <w:rPr>
+          <w:rFonts w:ascii="Arial" w:cs="Arial" w:eastAsia="Arial" w:hAnsi="Arial"/>
+          <w:b/>
+          <w:bCs/>
+          <w:color w:val="1F4E79"/>
+          <w:sz w:val="32"/>
+          <w:szCs w:val="32"/>
+        </w:rPr>
+        <w:t xml:space="preserve">13. Quick Reference — Flag Severity Guide</w:t>
       </w:r>
     </w:p>
     <w:p>

</xml_diff>